<commit_message>
completion of mlflow cheetsheet
</commit_message>
<xml_diff>
--- a/mlflow - Cheat_sheet.docx
+++ b/mlflow - Cheat_sheet.docx
@@ -66,6 +66,9 @@
     </w:p>
     <w:p/>
     <w:p>
+      <w:pPr>
+        <w:pStyle w:val="Heading3"/>
+      </w:pPr>
       <w:r>
         <w:rPr>
           <w:rFonts w:ascii="Segoe UI Emoji" w:hAnsi="Segoe UI Emoji" w:cs="Segoe UI Emoji"/>
@@ -176,6 +179,9 @@
       </w:r>
     </w:p>
     <w:p>
+      <w:pPr>
+        <w:pStyle w:val="Heading3"/>
+      </w:pPr>
       <w:r>
         <w:rPr>
           <w:rFonts w:ascii="Segoe UI Emoji" w:hAnsi="Segoe UI Emoji" w:cs="Segoe UI Emoji"/>
@@ -335,6 +341,9 @@
       </w:r>
     </w:p>
     <w:p>
+      <w:pPr>
+        <w:pStyle w:val="Heading2"/>
+      </w:pPr>
       <w:r>
         <w:rPr>
           <w:rFonts w:ascii="Segoe UI Emoji" w:hAnsi="Segoe UI Emoji" w:cs="Segoe UI Emoji"/>
@@ -346,6 +355,9 @@
       </w:r>
     </w:p>
     <w:p>
+      <w:pPr>
+        <w:pStyle w:val="Heading3"/>
+      </w:pPr>
       <w:r>
         <w:rPr>
           <w:rFonts w:ascii="Segoe UI Emoji" w:hAnsi="Segoe UI Emoji" w:cs="Segoe UI Emoji"/>
@@ -364,6 +376,9 @@
     </w:p>
     <w:p/>
     <w:p>
+      <w:pPr>
+        <w:pStyle w:val="Heading3"/>
+      </w:pPr>
       <w:r>
         <w:rPr>
           <w:rFonts w:ascii="Segoe UI Emoji" w:hAnsi="Segoe UI Emoji" w:cs="Segoe UI Emoji"/>
@@ -428,6 +443,9 @@
       </w:r>
     </w:p>
     <w:p>
+      <w:pPr>
+        <w:pStyle w:val="Heading3"/>
+      </w:pPr>
       <w:r>
         <w:rPr>
           <w:rFonts w:ascii="Segoe UI Emoji" w:hAnsi="Segoe UI Emoji" w:cs="Segoe UI Emoji"/>
@@ -582,6 +600,9 @@
     </w:p>
     <w:p/>
     <w:p>
+      <w:pPr>
+        <w:pStyle w:val="Heading2"/>
+      </w:pPr>
       <w:r>
         <w:rPr>
           <w:rFonts w:ascii="Segoe UI Emoji" w:hAnsi="Segoe UI Emoji" w:cs="Segoe UI Emoji"/>
@@ -589,7 +610,13 @@
         <w:t>🔷</w:t>
       </w:r>
       <w:r>
-        <w:t xml:space="preserve"> STEP 3: START MAIN RUN (CONTROL LAYER)</w:t>
+        <w:t xml:space="preserve"> STEP 3: START</w:t>
+      </w:r>
+      <w:r>
+        <w:t>\</w:t>
+      </w:r>
+      <w:r>
+        <w:t xml:space="preserve"> MAIN RUN (CONTROL LAYER)</w:t>
       </w:r>
     </w:p>
     <w:p>
@@ -611,6 +638,9 @@
     </w:p>
     <w:p/>
     <w:p>
+      <w:pPr>
+        <w:pStyle w:val="Heading3"/>
+      </w:pPr>
       <w:r>
         <w:rPr>
           <w:rFonts w:ascii="Segoe UI Emoji" w:hAnsi="Segoe UI Emoji" w:cs="Segoe UI Emoji"/>
@@ -776,6 +806,9 @@
     </w:p>
     <w:p/>
     <w:p>
+      <w:pPr>
+        <w:pStyle w:val="Heading3"/>
+      </w:pPr>
       <w:r>
         <w:rPr>
           <w:rFonts w:ascii="Segoe UI Symbol" w:hAnsi="Segoe UI Symbol" w:cs="Segoe UI Symbol"/>
@@ -901,6 +934,9 @@
     </w:p>
     <w:p/>
     <w:p>
+      <w:pPr>
+        <w:pStyle w:val="Heading2"/>
+      </w:pPr>
       <w:r>
         <w:rPr>
           <w:rFonts w:ascii="Segoe UI Emoji" w:hAnsi="Segoe UI Emoji" w:cs="Segoe UI Emoji"/>
@@ -912,6 +948,9 @@
       </w:r>
     </w:p>
     <w:p>
+      <w:pPr>
+        <w:pStyle w:val="Heading3"/>
+      </w:pPr>
       <w:r>
         <w:rPr>
           <w:rFonts w:ascii="Segoe UI Emoji" w:hAnsi="Segoe UI Emoji" w:cs="Segoe UI Emoji"/>
@@ -930,6 +969,9 @@
     </w:p>
     <w:p/>
     <w:p>
+      <w:pPr>
+        <w:pStyle w:val="Heading3"/>
+      </w:pPr>
       <w:r>
         <w:rPr>
           <w:rFonts w:ascii="Segoe UI Emoji" w:hAnsi="Segoe UI Emoji" w:cs="Segoe UI Emoji"/>
@@ -1210,6 +1252,9 @@
     </w:p>
     <w:p/>
     <w:p>
+      <w:pPr>
+        <w:pStyle w:val="Heading2"/>
+      </w:pPr>
       <w:r>
         <w:rPr>
           <w:rFonts w:ascii="Segoe UI Emoji" w:hAnsi="Segoe UI Emoji" w:cs="Segoe UI Emoji"/>
@@ -1244,6 +1289,9 @@
     </w:p>
     <w:p/>
     <w:p>
+      <w:pPr>
+        <w:pStyle w:val="Heading3"/>
+      </w:pPr>
       <w:r>
         <w:rPr>
           <w:rFonts w:ascii="Segoe UI Emoji" w:hAnsi="Segoe UI Emoji" w:cs="Segoe UI Emoji"/>
@@ -1525,6 +1573,9 @@
     </w:p>
     <w:p/>
     <w:p>
+      <w:pPr>
+        <w:pStyle w:val="Heading2"/>
+      </w:pPr>
       <w:r>
         <w:rPr>
           <w:rFonts w:ascii="Segoe UI Emoji" w:hAnsi="Segoe UI Emoji" w:cs="Segoe UI Emoji"/>
@@ -1536,6 +1587,9 @@
       </w:r>
     </w:p>
     <w:p>
+      <w:pPr>
+        <w:pStyle w:val="Heading3"/>
+      </w:pPr>
       <w:r>
         <w:rPr>
           <w:rFonts w:ascii="Segoe UI Emoji" w:hAnsi="Segoe UI Emoji" w:cs="Segoe UI Emoji"/>
@@ -1554,6 +1608,9 @@
     </w:p>
     <w:p/>
     <w:p>
+      <w:pPr>
+        <w:pStyle w:val="Heading3"/>
+      </w:pPr>
       <w:r>
         <w:rPr>
           <w:rFonts w:ascii="Segoe UI Emoji" w:hAnsi="Segoe UI Emoji" w:cs="Segoe UI Emoji"/>
@@ -1786,6 +1843,9 @@
     </w:p>
     <w:p/>
     <w:p>
+      <w:pPr>
+        <w:pStyle w:val="Heading2"/>
+      </w:pPr>
       <w:r>
         <w:rPr>
           <w:rFonts w:ascii="Segoe UI Emoji" w:hAnsi="Segoe UI Emoji" w:cs="Segoe UI Emoji"/>
@@ -1797,6 +1857,9 @@
       </w:r>
     </w:p>
     <w:p>
+      <w:pPr>
+        <w:pStyle w:val="Heading3"/>
+      </w:pPr>
       <w:r>
         <w:rPr>
           <w:rFonts w:ascii="Segoe UI Emoji" w:hAnsi="Segoe UI Emoji" w:cs="Segoe UI Emoji"/>
@@ -1815,6 +1878,9 @@
     </w:p>
     <w:p/>
     <w:p>
+      <w:pPr>
+        <w:pStyle w:val="Heading3"/>
+      </w:pPr>
       <w:r>
         <w:rPr>
           <w:rFonts w:ascii="Segoe UI Emoji" w:hAnsi="Segoe UI Emoji" w:cs="Segoe UI Emoji"/>
@@ -1962,6 +2028,9 @@
     </w:p>
     <w:p/>
     <w:p>
+      <w:pPr>
+        <w:pStyle w:val="Heading2"/>
+      </w:pPr>
       <w:r>
         <w:rPr>
           <w:rFonts w:ascii="Segoe UI Emoji" w:hAnsi="Segoe UI Emoji" w:cs="Segoe UI Emoji"/>
@@ -1973,6 +2042,9 @@
       </w:r>
     </w:p>
     <w:p>
+      <w:pPr>
+        <w:pStyle w:val="Heading3"/>
+      </w:pPr>
       <w:r>
         <w:rPr>
           <w:rFonts w:ascii="Segoe UI Emoji" w:hAnsi="Segoe UI Emoji" w:cs="Segoe UI Emoji"/>
@@ -1991,6 +2063,9 @@
     </w:p>
     <w:p/>
     <w:p>
+      <w:pPr>
+        <w:pStyle w:val="Heading3"/>
+      </w:pPr>
       <w:r>
         <w:rPr>
           <w:rFonts w:ascii="Segoe UI Emoji" w:hAnsi="Segoe UI Emoji" w:cs="Segoe UI Emoji"/>
@@ -2223,6 +2298,9 @@
     </w:p>
     <w:p/>
     <w:p>
+      <w:pPr>
+        <w:pStyle w:val="Heading2"/>
+      </w:pPr>
       <w:r>
         <w:rPr>
           <w:rFonts w:ascii="Segoe UI Emoji" w:hAnsi="Segoe UI Emoji" w:cs="Segoe UI Emoji"/>
@@ -2234,6 +2312,9 @@
       </w:r>
     </w:p>
     <w:p>
+      <w:pPr>
+        <w:pStyle w:val="Heading3"/>
+      </w:pPr>
       <w:r>
         <w:rPr>
           <w:rFonts w:ascii="Segoe UI Emoji" w:hAnsi="Segoe UI Emoji" w:cs="Segoe UI Emoji"/>
@@ -2252,6 +2333,9 @@
     </w:p>
     <w:p/>
     <w:p>
+      <w:pPr>
+        <w:pStyle w:val="Heading3"/>
+      </w:pPr>
       <w:r>
         <w:rPr>
           <w:rFonts w:ascii="Segoe UI Emoji" w:hAnsi="Segoe UI Emoji" w:cs="Segoe UI Emoji"/>
@@ -2565,6 +2649,9 @@
     </w:p>
     <w:p/>
     <w:p>
+      <w:pPr>
+        <w:pStyle w:val="Heading2"/>
+      </w:pPr>
       <w:r>
         <w:rPr>
           <w:rFonts w:ascii="Segoe UI Emoji" w:hAnsi="Segoe UI Emoji" w:cs="Segoe UI Emoji"/>
@@ -2663,7 +2750,7 @@
     <w:p>
       <w:r>
         <w:pict w14:anchorId="5AA4DF40">
-          <v:rect id="_x0000_i1217" style="width:0;height:1.5pt" o:hralign="center" o:hrstd="t" o:hr="t" fillcolor="#a0a0a0" stroked="f"/>
+          <v:rect id="_x0000_i1025" style="width:0;height:1.5pt" o:hralign="center" o:hrstd="t" o:hr="t" fillcolor="#a0a0a0" stroked="f"/>
         </w:pict>
       </w:r>
     </w:p>
@@ -2694,7 +2781,7 @@
       <w:r>
         <w:lastRenderedPageBreak/>
         <w:pict w14:anchorId="0215822E">
-          <v:rect id="_x0000_i1218" style="width:0;height:1.5pt" o:hralign="center" o:hrstd="t" o:hr="t" fillcolor="#a0a0a0" stroked="f"/>
+          <v:rect id="_x0000_i1026" style="width:0;height:1.5pt" o:hralign="center" o:hrstd="t" o:hr="t" fillcolor="#a0a0a0" stroked="f"/>
         </w:pict>
       </w:r>
     </w:p>
@@ -2767,7 +2854,7 @@
     <w:p>
       <w:r>
         <w:pict w14:anchorId="0E2FCFB8">
-          <v:rect id="_x0000_i1219" style="width:0;height:1.5pt" o:hralign="center" o:hrstd="t" o:hr="t" fillcolor="#a0a0a0" stroked="f"/>
+          <v:rect id="_x0000_i1027" style="width:0;height:1.5pt" o:hralign="center" o:hrstd="t" o:hr="t" fillcolor="#a0a0a0" stroked="f"/>
         </w:pict>
       </w:r>
     </w:p>
@@ -2868,7 +2955,7 @@
     <w:p>
       <w:r>
         <w:pict w14:anchorId="5B407161">
-          <v:rect id="_x0000_i1220" style="width:0;height:1.5pt" o:hralign="center" o:hrstd="t" o:hr="t" fillcolor="#a0a0a0" stroked="f"/>
+          <v:rect id="_x0000_i1028" style="width:0;height:1.5pt" o:hralign="center" o:hrstd="t" o:hr="t" fillcolor="#a0a0a0" stroked="f"/>
         </w:pict>
       </w:r>
     </w:p>
@@ -2898,7 +2985,7 @@
     <w:p>
       <w:r>
         <w:pict w14:anchorId="524A752C">
-          <v:rect id="_x0000_i1221" style="width:0;height:1.5pt" o:hralign="center" o:hrstd="t" o:hr="t" fillcolor="#a0a0a0" stroked="f"/>
+          <v:rect id="_x0000_i1029" style="width:0;height:1.5pt" o:hralign="center" o:hrstd="t" o:hr="t" fillcolor="#a0a0a0" stroked="f"/>
         </w:pict>
       </w:r>
     </w:p>
@@ -2992,7 +3079,7 @@
     <w:p>
       <w:r>
         <w:pict w14:anchorId="0D7DF826">
-          <v:rect id="_x0000_i1222" style="width:0;height:1.5pt" o:hralign="center" o:hrstd="t" o:hr="t" fillcolor="#a0a0a0" stroked="f"/>
+          <v:rect id="_x0000_i1030" style="width:0;height:1.5pt" o:hralign="center" o:hrstd="t" o:hr="t" fillcolor="#a0a0a0" stroked="f"/>
         </w:pict>
       </w:r>
     </w:p>
@@ -3033,7 +3120,7 @@
     <w:p>
       <w:r>
         <w:pict w14:anchorId="34A57125">
-          <v:rect id="_x0000_i1223" style="width:0;height:1.5pt" o:hralign="center" o:hrstd="t" o:hr="t" fillcolor="#a0a0a0" stroked="f"/>
+          <v:rect id="_x0000_i1031" style="width:0;height:1.5pt" o:hralign="center" o:hrstd="t" o:hr="t" fillcolor="#a0a0a0" stroked="f"/>
         </w:pict>
       </w:r>
     </w:p>
@@ -3126,7 +3213,7 @@
     <w:p>
       <w:r>
         <w:pict w14:anchorId="49F259C7">
-          <v:rect id="_x0000_i1224" style="width:0;height:1.5pt" o:hralign="center" o:hrstd="t" o:hr="t" fillcolor="#a0a0a0" stroked="f"/>
+          <v:rect id="_x0000_i1032" style="width:0;height:1.5pt" o:hralign="center" o:hrstd="t" o:hr="t" fillcolor="#a0a0a0" stroked="f"/>
         </w:pict>
       </w:r>
     </w:p>
@@ -3201,7 +3288,7 @@
     <w:p>
       <w:r>
         <w:pict w14:anchorId="716B101D">
-          <v:rect id="_x0000_i1225" style="width:0;height:1.5pt" o:hralign="center" o:hrstd="t" o:hr="t" fillcolor="#a0a0a0" stroked="f"/>
+          <v:rect id="_x0000_i1033" style="width:0;height:1.5pt" o:hralign="center" o:hrstd="t" o:hr="t" fillcolor="#a0a0a0" stroked="f"/>
         </w:pict>
       </w:r>
     </w:p>
@@ -3246,7 +3333,7 @@
     <w:p>
       <w:r>
         <w:pict w14:anchorId="33562D29">
-          <v:rect id="_x0000_i1226" style="width:0;height:1.5pt" o:hralign="center" o:hrstd="t" o:hr="t" fillcolor="#a0a0a0" stroked="f"/>
+          <v:rect id="_x0000_i1034" style="width:0;height:1.5pt" o:hralign="center" o:hrstd="t" o:hr="t" fillcolor="#a0a0a0" stroked="f"/>
         </w:pict>
       </w:r>
     </w:p>
@@ -3327,7 +3414,7 @@
     <w:p>
       <w:r>
         <w:pict w14:anchorId="0C0F44DB">
-          <v:rect id="_x0000_i1227" style="width:0;height:1.5pt" o:hralign="center" o:hrstd="t" o:hr="t" fillcolor="#a0a0a0" stroked="f"/>
+          <v:rect id="_x0000_i1035" style="width:0;height:1.5pt" o:hralign="center" o:hrstd="t" o:hr="t" fillcolor="#a0a0a0" stroked="f"/>
         </w:pict>
       </w:r>
     </w:p>
@@ -3375,7 +3462,7 @@
     <w:p>
       <w:r>
         <w:pict w14:anchorId="40D1398F">
-          <v:rect id="_x0000_i1228" style="width:0;height:1.5pt" o:hralign="center" o:hrstd="t" o:hr="t" fillcolor="#a0a0a0" stroked="f"/>
+          <v:rect id="_x0000_i1036" style="width:0;height:1.5pt" o:hralign="center" o:hrstd="t" o:hr="t" fillcolor="#a0a0a0" stroked="f"/>
         </w:pict>
       </w:r>
     </w:p>
@@ -3487,7 +3574,7 @@
     <w:p>
       <w:r>
         <w:pict w14:anchorId="3599FF09">
-          <v:rect id="_x0000_i1229" style="width:0;height:1.5pt" o:hralign="center" o:hrstd="t" o:hr="t" fillcolor="#a0a0a0" stroked="f"/>
+          <v:rect id="_x0000_i1037" style="width:0;height:1.5pt" o:hralign="center" o:hrstd="t" o:hr="t" fillcolor="#a0a0a0" stroked="f"/>
         </w:pict>
       </w:r>
     </w:p>
@@ -3561,7 +3648,7 @@
     <w:p>
       <w:r>
         <w:pict w14:anchorId="6FD9DF2C">
-          <v:rect id="_x0000_i1230" style="width:0;height:1.5pt" o:hralign="center" o:hrstd="t" o:hr="t" fillcolor="#a0a0a0" stroked="f"/>
+          <v:rect id="_x0000_i1038" style="width:0;height:1.5pt" o:hralign="center" o:hrstd="t" o:hr="t" fillcolor="#a0a0a0" stroked="f"/>
         </w:pict>
       </w:r>
     </w:p>
@@ -3625,7 +3712,7 @@
     <w:p>
       <w:r>
         <w:pict w14:anchorId="14539233">
-          <v:rect id="_x0000_i1231" style="width:0;height:1.5pt" o:hralign="center" o:hrstd="t" o:hr="t" fillcolor="#a0a0a0" stroked="f"/>
+          <v:rect id="_x0000_i1039" style="width:0;height:1.5pt" o:hralign="center" o:hrstd="t" o:hr="t" fillcolor="#a0a0a0" stroked="f"/>
         </w:pict>
       </w:r>
     </w:p>
@@ -3698,7 +3785,7 @@
     <w:p>
       <w:r>
         <w:pict w14:anchorId="651C61B4">
-          <v:rect id="_x0000_i1232" style="width:0;height:1.5pt" o:hralign="center" o:hrstd="t" o:hr="t" fillcolor="#a0a0a0" stroked="f"/>
+          <v:rect id="_x0000_i1040" style="width:0;height:1.5pt" o:hralign="center" o:hrstd="t" o:hr="t" fillcolor="#a0a0a0" stroked="f"/>
         </w:pict>
       </w:r>
     </w:p>
@@ -3751,7 +3838,7 @@
     <w:p>
       <w:r>
         <w:pict w14:anchorId="0CDD128E">
-          <v:rect id="_x0000_i1233" style="width:0;height:1.5pt" o:hralign="center" o:hrstd="t" o:hr="t" fillcolor="#a0a0a0" stroked="f"/>
+          <v:rect id="_x0000_i1041" style="width:0;height:1.5pt" o:hralign="center" o:hrstd="t" o:hr="t" fillcolor="#a0a0a0" stroked="f"/>
         </w:pict>
       </w:r>
     </w:p>
@@ -3906,7 +3993,7 @@
     <w:p>
       <w:r>
         <w:pict w14:anchorId="181D9519">
-          <v:rect id="_x0000_i1234" style="width:0;height:1.5pt" o:hralign="center" o:hrstd="t" o:hr="t" fillcolor="#a0a0a0" stroked="f"/>
+          <v:rect id="_x0000_i1042" style="width:0;height:1.5pt" o:hralign="center" o:hrstd="t" o:hr="t" fillcolor="#a0a0a0" stroked="f"/>
         </w:pict>
       </w:r>
     </w:p>
@@ -3951,7 +4038,7 @@
     <w:p>
       <w:r>
         <w:pict w14:anchorId="41EDACCF">
-          <v:rect id="_x0000_i1235" style="width:0;height:1.5pt" o:hralign="center" o:hrstd="t" o:hr="t" fillcolor="#a0a0a0" stroked="f"/>
+          <v:rect id="_x0000_i1043" style="width:0;height:1.5pt" o:hralign="center" o:hrstd="t" o:hr="t" fillcolor="#a0a0a0" stroked="f"/>
         </w:pict>
       </w:r>
     </w:p>
@@ -4076,7 +4163,7 @@
     <w:p>
       <w:r>
         <w:pict w14:anchorId="560B5B0A">
-          <v:rect id="_x0000_i1236" style="width:0;height:1.5pt" o:hralign="center" o:hrstd="t" o:hr="t" fillcolor="#a0a0a0" stroked="f"/>
+          <v:rect id="_x0000_i1044" style="width:0;height:1.5pt" o:hralign="center" o:hrstd="t" o:hr="t" fillcolor="#a0a0a0" stroked="f"/>
         </w:pict>
       </w:r>
     </w:p>
@@ -4164,7 +4251,7 @@
     <w:p>
       <w:r>
         <w:pict w14:anchorId="0CB0604F">
-          <v:rect id="_x0000_i1237" style="width:0;height:1.5pt" o:hralign="center" o:hrstd="t" o:hr="t" fillcolor="#a0a0a0" stroked="f"/>
+          <v:rect id="_x0000_i1045" style="width:0;height:1.5pt" o:hralign="center" o:hrstd="t" o:hr="t" fillcolor="#a0a0a0" stroked="f"/>
         </w:pict>
       </w:r>
     </w:p>
@@ -4237,7 +4324,7 @@
     <w:p>
       <w:r>
         <w:pict w14:anchorId="656B69B9">
-          <v:rect id="_x0000_i1238" style="width:0;height:1.5pt" o:hralign="center" o:hrstd="t" o:hr="t" fillcolor="#a0a0a0" stroked="f"/>
+          <v:rect id="_x0000_i1046" style="width:0;height:1.5pt" o:hralign="center" o:hrstd="t" o:hr="t" fillcolor="#a0a0a0" stroked="f"/>
         </w:pict>
       </w:r>
     </w:p>
@@ -4326,7 +4413,7 @@
     <w:p>
       <w:r>
         <w:pict w14:anchorId="64C3D2CB">
-          <v:rect id="_x0000_i1239" style="width:0;height:1.5pt" o:hralign="center" o:hrstd="t" o:hr="t" fillcolor="#a0a0a0" stroked="f"/>
+          <v:rect id="_x0000_i1047" style="width:0;height:1.5pt" o:hralign="center" o:hrstd="t" o:hr="t" fillcolor="#a0a0a0" stroked="f"/>
         </w:pict>
       </w:r>
     </w:p>
@@ -4399,7 +4486,7 @@
     <w:p>
       <w:r>
         <w:pict w14:anchorId="477AA7DD">
-          <v:rect id="_x0000_i1240" style="width:0;height:1.5pt" o:hralign="center" o:hrstd="t" o:hr="t" fillcolor="#a0a0a0" stroked="f"/>
+          <v:rect id="_x0000_i1048" style="width:0;height:1.5pt" o:hralign="center" o:hrstd="t" o:hr="t" fillcolor="#a0a0a0" stroked="f"/>
         </w:pict>
       </w:r>
     </w:p>
@@ -4488,7 +4575,7 @@
     <w:p>
       <w:r>
         <w:pict w14:anchorId="47869543">
-          <v:rect id="_x0000_i1241" style="width:0;height:1.5pt" o:hralign="center" o:hrstd="t" o:hr="t" fillcolor="#a0a0a0" stroked="f"/>
+          <v:rect id="_x0000_i1049" style="width:0;height:1.5pt" o:hralign="center" o:hrstd="t" o:hr="t" fillcolor="#a0a0a0" stroked="f"/>
         </w:pict>
       </w:r>
     </w:p>
@@ -4518,7 +4605,7 @@
     <w:p>
       <w:r>
         <w:pict w14:anchorId="11190C3A">
-          <v:rect id="_x0000_i1242" style="width:0;height:1.5pt" o:hralign="center" o:hrstd="t" o:hr="t" fillcolor="#a0a0a0" stroked="f"/>
+          <v:rect id="_x0000_i1050" style="width:0;height:1.5pt" o:hralign="center" o:hrstd="t" o:hr="t" fillcolor="#a0a0a0" stroked="f"/>
         </w:pict>
       </w:r>
     </w:p>
@@ -4604,7 +4691,7 @@
     <w:p>
       <w:r>
         <w:pict w14:anchorId="08F6BB3B">
-          <v:rect id="_x0000_i1243" style="width:0;height:1.5pt" o:hralign="center" o:hrstd="t" o:hr="t" fillcolor="#a0a0a0" stroked="f"/>
+          <v:rect id="_x0000_i1051" style="width:0;height:1.5pt" o:hralign="center" o:hrstd="t" o:hr="t" fillcolor="#a0a0a0" stroked="f"/>
         </w:pict>
       </w:r>
     </w:p>
@@ -4682,7 +4769,7 @@
     <w:p>
       <w:r>
         <w:pict w14:anchorId="7C7975B6">
-          <v:rect id="_x0000_i1244" style="width:0;height:1.5pt" o:hralign="center" o:hrstd="t" o:hr="t" fillcolor="#a0a0a0" stroked="f"/>
+          <v:rect id="_x0000_i1052" style="width:0;height:1.5pt" o:hralign="center" o:hrstd="t" o:hr="t" fillcolor="#a0a0a0" stroked="f"/>
         </w:pict>
       </w:r>
     </w:p>
@@ -4755,7 +4842,7 @@
     <w:p>
       <w:r>
         <w:pict w14:anchorId="5AA5B88F">
-          <v:rect id="_x0000_i1245" style="width:0;height:1.5pt" o:hralign="center" o:hrstd="t" o:hr="t" fillcolor="#a0a0a0" stroked="f"/>
+          <v:rect id="_x0000_i1053" style="width:0;height:1.5pt" o:hralign="center" o:hrstd="t" o:hr="t" fillcolor="#a0a0a0" stroked="f"/>
         </w:pict>
       </w:r>
     </w:p>
@@ -4816,7 +4903,7 @@
     <w:p>
       <w:r>
         <w:pict w14:anchorId="22A62017">
-          <v:rect id="_x0000_i1246" style="width:0;height:1.5pt" o:hralign="center" o:hrstd="t" o:hr="t" fillcolor="#a0a0a0" stroked="f"/>
+          <v:rect id="_x0000_i1054" style="width:0;height:1.5pt" o:hralign="center" o:hrstd="t" o:hr="t" fillcolor="#a0a0a0" stroked="f"/>
         </w:pict>
       </w:r>
     </w:p>
@@ -4846,7 +4933,7 @@
     <w:p>
       <w:r>
         <w:pict w14:anchorId="5A29D989">
-          <v:rect id="_x0000_i1247" style="width:0;height:1.5pt" o:hralign="center" o:hrstd="t" o:hr="t" fillcolor="#a0a0a0" stroked="f"/>
+          <v:rect id="_x0000_i1055" style="width:0;height:1.5pt" o:hralign="center" o:hrstd="t" o:hr="t" fillcolor="#a0a0a0" stroked="f"/>
         </w:pict>
       </w:r>
     </w:p>
@@ -4931,7 +5018,7 @@
     <w:p>
       <w:r>
         <w:pict w14:anchorId="128B4C0B">
-          <v:rect id="_x0000_i1248" style="width:0;height:1.5pt" o:hralign="center" o:hrstd="t" o:hr="t" fillcolor="#a0a0a0" stroked="f"/>
+          <v:rect id="_x0000_i1056" style="width:0;height:1.5pt" o:hralign="center" o:hrstd="t" o:hr="t" fillcolor="#a0a0a0" stroked="f"/>
         </w:pict>
       </w:r>
     </w:p>
@@ -6755,7 +6842,6 @@
     <w:next w:val="Normal"/>
     <w:link w:val="Heading3Char"/>
     <w:uiPriority w:val="9"/>
-    <w:semiHidden/>
     <w:unhideWhenUsed/>
     <w:qFormat/>
     <w:rsid w:val="005977BC"/>
@@ -6907,6 +6993,7 @@
   <w:style w:type="character" w:default="1" w:styleId="DefaultParagraphFont">
     <w:name w:val="Default Paragraph Font"/>
     <w:uiPriority w:val="1"/>
+    <w:semiHidden/>
     <w:unhideWhenUsed/>
   </w:style>
   <w:style w:type="table" w:default="1" w:styleId="TableNormal">
@@ -6961,7 +7048,6 @@
     <w:basedOn w:val="DefaultParagraphFont"/>
     <w:link w:val="Heading3"/>
     <w:uiPriority w:val="9"/>
-    <w:semiHidden/>
     <w:rsid w:val="005977BC"/>
     <w:rPr>
       <w:rFonts w:eastAsiaTheme="majorEastAsia" w:cstheme="majorBidi"/>

</xml_diff>